<commit_message>
minor changes in Requirement Document
</commit_message>
<xml_diff>
--- a/Documentation/Add Expense API - Requirement Document.docx
+++ b/Documentation/Add Expense API - Requirement Document.docx
@@ -897,7 +897,13 @@
               <w:t>multiple users</w:t>
             </w:r>
             <w:r>
-              <w:t> in a single expense (min 2, max 50)</w:t>
+              <w:t xml:space="preserve"> in a single expense (min </w:t>
+            </w:r>
+            <w:r>
+              <w:t>1</w:t>
+            </w:r>
+            <w:r>
+              <w:t>, max 50)</w:t>
             </w:r>
           </w:p>
         </w:tc>
@@ -1035,6 +1041,30 @@
               <w:t>High</w:t>
             </w:r>
           </w:p>
+        </w:tc>
+      </w:tr>
+      <w:tr>
+        <w:tc>
+          <w:tcPr>
+            <w:tcW w:w="3005" w:type="dxa"/>
+          </w:tcPr>
+          <w:p>
+            <w:r>
+              <w:t>FR-13.1</w:t>
+            </w:r>
+          </w:p>
+        </w:tc>
+        <w:tc>
+          <w:tcPr>
+            <w:tcW w:w="3005" w:type="dxa"/>
+          </w:tcPr>
+          <w:p/>
+        </w:tc>
+        <w:tc>
+          <w:tcPr>
+            <w:tcW w:w="3006" w:type="dxa"/>
+          </w:tcPr>
+          <w:p/>
         </w:tc>
       </w:tr>
       <w:tr>
@@ -1363,6 +1393,7 @@
           </w:tcPr>
           <w:p>
             <w:r>
+              <w:lastRenderedPageBreak/>
               <w:t>FR-21</w:t>
             </w:r>
           </w:p>
@@ -1405,7 +1436,6 @@
           </w:tcPr>
           <w:p>
             <w:r>
-              <w:lastRenderedPageBreak/>
               <w:t>FR-22</w:t>
             </w:r>
           </w:p>
@@ -1448,6 +1478,16 @@
         </w:rPr>
         <w:t>2.6 Image / Receipt Capture</w:t>
       </w:r>
+      <w:r>
+        <w:rPr>
+          <w:b/>
+          <w:bCs/>
+        </w:rPr>
+        <w:t xml:space="preserve"> </w:t>
+      </w:r>
+      <w:r>
+        <w:t>(Optional)</w:t>
+      </w:r>
     </w:p>
     <w:tbl>
       <w:tblPr>
@@ -1492,6 +1532,9 @@
             <w:r>
               <w:t xml:space="preserve"> (For Mobile App)</w:t>
             </w:r>
+            <w:r>
+              <w:t xml:space="preserve"> </w:t>
+            </w:r>
           </w:p>
         </w:tc>
         <w:tc>
@@ -1512,10 +1555,7 @@
           </w:tcPr>
           <w:p>
             <w:r>
-              <w:t>FR-2</w:t>
-            </w:r>
-            <w:r>
-              <w:t>4</w:t>
+              <w:t>FR-24</w:t>
             </w:r>
           </w:p>
         </w:tc>
@@ -1560,10 +1600,7 @@
           </w:tcPr>
           <w:p>
             <w:r>
-              <w:t>FR-2</w:t>
-            </w:r>
-            <w:r>
-              <w:t>5</w:t>
+              <w:t>FR-25</w:t>
             </w:r>
           </w:p>
         </w:tc>
@@ -1595,10 +1632,7 @@
           </w:tcPr>
           <w:p>
             <w:r>
-              <w:t>FR-2</w:t>
-            </w:r>
-            <w:r>
-              <w:t>6</w:t>
+              <w:t>FR-26</w:t>
             </w:r>
           </w:p>
         </w:tc>
@@ -1630,10 +1664,7 @@
           </w:tcPr>
           <w:p>
             <w:r>
-              <w:t>FR-2</w:t>
-            </w:r>
-            <w:r>
-              <w:t>7</w:t>
+              <w:t>FR-27</w:t>
             </w:r>
           </w:p>
         </w:tc>
@@ -1673,10 +1704,7 @@
           </w:tcPr>
           <w:p>
             <w:r>
-              <w:t>FR-2</w:t>
-            </w:r>
-            <w:r>
-              <w:t>8</w:t>
+              <w:t>FR-28</w:t>
             </w:r>
           </w:p>
         </w:tc>
@@ -1769,10 +1797,7 @@
           </w:tcPr>
           <w:p>
             <w:r>
-              <w:t>NFR-0</w:t>
-            </w:r>
-            <w:r>
-              <w:t>2</w:t>
+              <w:t>NFR-02</w:t>
             </w:r>
           </w:p>
         </w:tc>
@@ -1804,10 +1829,7 @@
           </w:tcPr>
           <w:p>
             <w:r>
-              <w:t>NFR-0</w:t>
-            </w:r>
-            <w:r>
-              <w:t>3</w:t>
+              <w:t>NFR-03</w:t>
             </w:r>
           </w:p>
         </w:tc>
@@ -1839,10 +1861,7 @@
           </w:tcPr>
           <w:p>
             <w:r>
-              <w:t>NFR-0</w:t>
-            </w:r>
-            <w:r>
-              <w:t>4</w:t>
+              <w:t>NFR-04</w:t>
             </w:r>
           </w:p>
         </w:tc>
@@ -1866,28 +1885,19 @@
           </w:tcPr>
           <w:p>
             <w:r>
-              <w:t xml:space="preserve">100% precise split calculations (no </w:t>
-            </w:r>
-            <w:r>
-              <w:t>floating-point</w:t>
-            </w:r>
-            <w:r>
-              <w:t xml:space="preserve"> errors)</w:t>
-            </w:r>
-          </w:p>
-        </w:tc>
-      </w:tr>
-      <w:tr>
-        <w:tc>
-          <w:tcPr>
-            <w:tcW w:w="3005" w:type="dxa"/>
-          </w:tcPr>
-          <w:p>
-            <w:r>
-              <w:t>NFR-0</w:t>
-            </w:r>
-            <w:r>
-              <w:t>5</w:t>
+              <w:t>100% precise split calculations (no floating-point errors)</w:t>
+            </w:r>
+          </w:p>
+        </w:tc>
+      </w:tr>
+      <w:tr>
+        <w:tc>
+          <w:tcPr>
+            <w:tcW w:w="3005" w:type="dxa"/>
+          </w:tcPr>
+          <w:p>
+            <w:r>
+              <w:t>NFR-05</w:t>
             </w:r>
           </w:p>
         </w:tc>
@@ -1923,10 +1933,7 @@
           </w:tcPr>
           <w:p>
             <w:r>
-              <w:t>NFR-0</w:t>
-            </w:r>
-            <w:r>
-              <w:t>6</w:t>
+              <w:t>NFR-06</w:t>
             </w:r>
           </w:p>
         </w:tc>
@@ -1956,6 +1963,8 @@
         </w:tc>
       </w:tr>
     </w:tbl>
+    <w:p/>
+    <w:p/>
     <w:p/>
     <w:sectPr>
       <w:pgSz w:w="11906" w:h="16838"/>
@@ -2662,6 +2671,7 @@
   <w:style w:type="character" w:default="1" w:styleId="DefaultParagraphFont">
     <w:name w:val="Default Paragraph Font"/>
     <w:uiPriority w:val="1"/>
+    <w:semiHidden/>
     <w:unhideWhenUsed/>
   </w:style>
   <w:style w:type="table" w:default="1" w:styleId="TableNormal">

</xml_diff>